<commit_message>
Update proposal docx to milestone version; add reflection & replanning
Replaces the repo proposal docx with the 2026-07-23 version (Vaibhav's
milestone front-matter). Adds docs/proposal-reflection-replanning.md:
paste-ready Reflection/Replanning for each milestone point, grounded in
the current repo state (adversarial-review remediation, LLM-judge/tool-use
legs). Point 1(1) reproduced unchanged; nothing overwritten.

Co-Authored-By: Claude Fable 5 <noreply@anthropic.com>
</commit_message>
<xml_diff>
--- a/SandBox Project.docx
+++ b/SandBox Project.docx
@@ -2,6 +2,743 @@
 <file path=word/document.xml><?xml version="1.0" encoding="utf-8"?>
 <w:document xmlns:mc="http://schemas.openxmlformats.org/markup-compatibility/2006" xmlns:o="urn:schemas-microsoft-com:office:office" xmlns:r="http://schemas.openxmlformats.org/officeDocument/2006/relationships" xmlns:m="http://schemas.openxmlformats.org/officeDocument/2006/math" xmlns:v="urn:schemas-microsoft-com:vml" xmlns:wp="http://schemas.openxmlformats.org/drawingml/2006/wordprocessingDrawing" xmlns:w10="urn:schemas-microsoft-com:office:word" xmlns:w="http://schemas.openxmlformats.org/wordprocessingml/2006/main" xmlns:wne="http://schemas.microsoft.com/office/word/2006/wordml" xmlns:sl="http://schemas.openxmlformats.org/schemaLibrary/2006/main" xmlns:a="http://schemas.openxmlformats.org/drawingml/2006/main" xmlns:pic="http://schemas.openxmlformats.org/drawingml/2006/picture" xmlns:c="http://schemas.openxmlformats.org/drawingml/2006/chart" xmlns:lc="http://schemas.openxmlformats.org/drawingml/2006/lockedCanvas" xmlns:dgm="http://schemas.openxmlformats.org/drawingml/2006/diagram" xmlns:wps="http://schemas.microsoft.com/office/word/2010/wordprocessingShape" xmlns:wpg="http://schemas.microsoft.com/office/word/2010/wordprocessingGroup" xmlns:w14="http://schemas.microsoft.com/office/word/2010/wordml" xmlns:w15="http://schemas.microsoft.com/office/word/2012/wordml" xmlns:w16="http://schemas.microsoft.com/office/word/2018/wordml" xmlns:w16cex="http://schemas.microsoft.com/office/word/2018/wordml/cex" xmlns:w16cid="http://schemas.microsoft.com/office/word/2016/wordml/cid" xmlns="http://schemas.microsoft.com/office/tasks/2019/documenttasks" xmlns:cr="http://schemas.microsoft.com/office/comments/2020/reactions">
   <w:body>
+    <w:p>
+      <w:pPr>
+        <w:jc w:val="center"/>
+        <w:rPr>
+          <w:b w:val="1"/>
+          <w:bCs w:val="1"/>
+          <w:sz w:val="40"/>
+          <w:szCs w:val="40"/>
+        </w:rPr>
+      </w:pPr>
+      <w:r>
+        <w:rPr>
+          <w:b w:val="1"/>
+          <w:bCs w:val="1"/>
+          <w:sz w:val="40"/>
+          <w:szCs w:val="40"/>
+          <w:rtl w:val="0"/>
+        </w:rPr>
+        <w:t xml:space="preserve">CS5100 project milestones:</w:t>
+      </w:r>
+    </w:p>
+    <w:p>
+      <w:pPr>
+        <w:jc w:val="center"/>
+        <w:rPr>
+          <w:b w:val="1"/>
+          <w:bCs w:val="1"/>
+          <w:sz w:val="40"/>
+          <w:szCs w:val="40"/>
+        </w:rPr>
+      </w:pPr>
+      <w:r>
+        <w:rPr>
+          <w:b w:val="1"/>
+          <w:bCs w:val="1"/>
+          <w:sz w:val="40"/>
+          <w:szCs w:val="40"/>
+          <w:rtl w:val="0"/>
+        </w:rPr>
+        <w:t xml:space="preserve">Terminating Markov decision processes for catastrophic action prevention</w:t>
+      </w:r>
+    </w:p>
+    <w:p>
+      <w:pPr>
+        <w:jc w:val="center"/>
+        <w:rPr>
+          <w:b w:val="1"/>
+          <w:bCs w:val="1"/>
+          <w:sz w:val="40"/>
+          <w:szCs w:val="40"/>
+        </w:rPr>
+      </w:pPr>
+      <w:r>
+        <w:rPr>
+          <w:rtl w:val="0"/>
+        </w:rPr>
+      </w:r>
+    </w:p>
+    <w:p>
+      <w:pPr>
+        <w:spacing w:after="200" w:lineRule="auto"/>
+        <w:rPr>
+          <w:b w:val="1"/>
+          <w:bCs w:val="1"/>
+          <w:sz w:val="28"/>
+          <w:szCs w:val="28"/>
+        </w:rPr>
+      </w:pPr>
+      <w:r>
+        <w:rPr>
+          <w:b w:val="1"/>
+          <w:bCs w:val="1"/>
+          <w:sz w:val="28"/>
+          <w:szCs w:val="28"/>
+          <w:rtl w:val="0"/>
+        </w:rPr>
+        <w:t xml:space="preserve">Team members &amp; responsibilities</w:t>
+      </w:r>
+    </w:p>
+    <w:p>
+      <w:pPr>
+        <w:rPr/>
+      </w:pPr>
+      <w:r>
+        <w:rPr>
+          <w:rtl w:val="0"/>
+        </w:rPr>
+        <w:t xml:space="preserve">Ethan Doherty - </w:t>
+      </w:r>
+      <w:hyperlink r:id="rId6">
+        <w:r>
+          <w:rPr>
+            <w:color w:val="1155cc"/>
+            <w:u w:val="single"/>
+            <w:rtl w:val="0"/>
+          </w:rPr>
+          <w:t xml:space="preserve">doherty.eth@northeastern.edu</w:t>
+        </w:r>
+      </w:hyperlink>
+      <w:r>
+        <w:rPr>
+          <w:rtl w:val="0"/>
+        </w:rPr>
+      </w:r>
+    </w:p>
+    <w:p>
+      <w:pPr>
+        <w:rPr/>
+      </w:pPr>
+      <w:r>
+        <w:rPr>
+          <w:rtl w:val="0"/>
+        </w:rPr>
+        <w:t xml:space="preserve">Responsibilities: code architecture, scalable deployment</w:t>
+      </w:r>
+    </w:p>
+    <w:p>
+      <w:pPr>
+        <w:rPr/>
+      </w:pPr>
+      <w:r>
+        <w:rPr>
+          <w:rtl w:val="0"/>
+        </w:rPr>
+        <w:t xml:space="preserve">Vaibhav Srivastava - </w:t>
+      </w:r>
+      <w:hyperlink r:id="rId7">
+        <w:r>
+          <w:rPr>
+            <w:color w:val="1155cc"/>
+            <w:u w:val="single"/>
+            <w:rtl w:val="0"/>
+          </w:rPr>
+          <w:t xml:space="preserve">srivastava.vaib@northeastern.edu</w:t>
+        </w:r>
+      </w:hyperlink>
+      <w:r>
+        <w:rPr>
+          <w:rtl w:val="0"/>
+        </w:rPr>
+      </w:r>
+    </w:p>
+    <w:p>
+      <w:pPr>
+        <w:rPr/>
+      </w:pPr>
+      <w:r>
+        <w:rPr>
+          <w:rtl w:val="0"/>
+        </w:rPr>
+        <w:t xml:space="preserve">Responsibilities: problem formulation, cybersecurity framework, sandbox environment</w:t>
+      </w:r>
+    </w:p>
+    <w:p>
+      <w:pPr>
+        <w:rPr/>
+      </w:pPr>
+      <w:r>
+        <w:rPr>
+          <w:rtl w:val="0"/>
+        </w:rPr>
+        <w:t xml:space="preserve">Rui Xian - </w:t>
+      </w:r>
+      <w:hyperlink r:id="rId8">
+        <w:r>
+          <w:rPr>
+            <w:color w:val="1155cc"/>
+            <w:u w:val="single"/>
+            <w:rtl w:val="0"/>
+          </w:rPr>
+          <w:t xml:space="preserve">xian.r@northeastern.edu</w:t>
+        </w:r>
+      </w:hyperlink>
+      <w:r>
+        <w:rPr>
+          <w:rtl w:val="0"/>
+        </w:rPr>
+      </w:r>
+    </w:p>
+    <w:p>
+      <w:pPr>
+        <w:rPr>
+          <w:b w:val="1"/>
+          <w:bCs w:val="1"/>
+          <w:sz w:val="28"/>
+          <w:szCs w:val="28"/>
+        </w:rPr>
+      </w:pPr>
+      <w:r>
+        <w:rPr>
+          <w:rtl w:val="0"/>
+        </w:rPr>
+        <w:t xml:space="preserve">Responsibilities: problem formulation, theoretical framework, code architecture</w:t>
+      </w:r>
+      <w:r>
+        <w:rPr>
+          <w:rtl w:val="0"/>
+        </w:rPr>
+      </w:r>
+    </w:p>
+    <w:p>
+      <w:pPr>
+        <w:spacing w:after="200" w:lineRule="auto"/>
+        <w:rPr>
+          <w:b w:val="1"/>
+          <w:bCs w:val="1"/>
+          <w:sz w:val="28"/>
+          <w:szCs w:val="28"/>
+        </w:rPr>
+      </w:pPr>
+      <w:r>
+        <w:rPr>
+          <w:rtl w:val="0"/>
+        </w:rPr>
+      </w:r>
+    </w:p>
+    <w:p>
+      <w:pPr>
+        <w:spacing w:after="200" w:lineRule="auto"/>
+        <w:rPr>
+          <w:b w:val="1"/>
+          <w:bCs w:val="1"/>
+          <w:sz w:val="24"/>
+          <w:szCs w:val="24"/>
+        </w:rPr>
+      </w:pPr>
+      <w:r>
+        <w:rPr>
+          <w:b w:val="1"/>
+          <w:bCs w:val="1"/>
+          <w:sz w:val="28"/>
+          <w:szCs w:val="28"/>
+          <w:rtl w:val="0"/>
+        </w:rPr>
+        <w:t xml:space="preserve">1. Theory milestones</w:t>
+      </w:r>
+      <w:r>
+        <w:rPr>
+          <w:rtl w:val="0"/>
+        </w:rPr>
+      </w:r>
+    </w:p>
+    <w:p>
+      <w:pPr>
+        <w:spacing w:after="200" w:lineRule="auto"/>
+        <w:rPr/>
+      </w:pPr>
+      <w:r>
+        <w:rPr>
+          <w:rtl w:val="0"/>
+        </w:rPr>
+        <w:t xml:space="preserve">The theory milestones concerns p</w:t>
+      </w:r>
+      <w:r>
+        <w:rPr>
+          <w:rtl w:val="0"/>
+        </w:rPr>
+        <w:t xml:space="preserve">roblem formulation</w:t>
+      </w:r>
+    </w:p>
+    <w:p>
+      <w:pPr>
+        <w:spacing w:after="200" w:lineRule="auto"/>
+        <w:rPr/>
+      </w:pPr>
+      <w:r>
+        <w:rPr>
+          <w:b w:val="1"/>
+          <w:bCs w:val="1"/>
+          <w:rtl w:val="0"/>
+        </w:rPr>
+        <w:t xml:space="preserve">(1) T-MDP.</w:t>
+      </w:r>
+      <w:r>
+        <w:rPr>
+          <w:rtl w:val="0"/>
+        </w:rPr>
+        <w:t xml:space="preserve"> We consider an MDP with a goal state (task completed) and a terminated state (task terminated), both of which are absorbing states (Figure 1). We call this modified MDP a T-MDP. At each step in the agent trajectory, it has the option to continue or stop.</w:t>
+      </w:r>
+    </w:p>
+    <w:p>
+      <w:pPr>
+        <w:spacing w:after="200" w:lineRule="auto"/>
+        <w:rPr/>
+      </w:pPr>
+      <w:r>
+        <w:rPr>
+          <w:rtl w:val="0"/>
+        </w:rPr>
+        <w:t xml:space="preserve">We developed a formulation of T-MDP</w:t>
+      </w:r>
+    </w:p>
+    <w:p>
+      <w:pPr>
+        <w:spacing w:after="200" w:lineRule="auto"/>
+        <w:rPr/>
+      </w:pPr>
+      <w:r>
+        <w:rPr>
+          <w:u w:val="single"/>
+          <w:rtl w:val="0"/>
+        </w:rPr>
+        <w:t xml:space="preserve">Reflection</w:t>
+      </w:r>
+      <w:r>
+        <w:rPr>
+          <w:rtl w:val="0"/>
+        </w:rPr>
+        <w:t xml:space="preserve">: This part of the project has been progressing well.</w:t>
+      </w:r>
+    </w:p>
+    <w:p>
+      <w:pPr>
+        <w:spacing w:after="200" w:lineRule="auto"/>
+        <w:rPr/>
+      </w:pPr>
+      <w:r>
+        <w:rPr>
+          <w:u w:val="single"/>
+          <w:rtl w:val="0"/>
+        </w:rPr>
+        <w:t xml:space="preserve">Replanning</w:t>
+      </w:r>
+      <w:r>
+        <w:rPr>
+          <w:rtl w:val="0"/>
+        </w:rPr>
+        <w:t xml:space="preserve">: Not needed.</w:t>
+      </w:r>
+    </w:p>
+    <w:p>
+      <w:pPr>
+        <w:spacing w:after="200" w:lineRule="auto"/>
+        <w:rPr/>
+      </w:pPr>
+      <w:r>
+        <w:rPr>
+          <w:b w:val="1"/>
+          <w:bCs w:val="1"/>
+          <w:rtl w:val="0"/>
+        </w:rPr>
+        <w:t xml:space="preserve">(2) Context-based risk score.</w:t>
+      </w:r>
+      <w:r>
+        <w:rPr>
+          <w:rtl w:val="0"/>
+        </w:rPr>
+        <w:t xml:space="preserve"> We consider a risk score obtained by random sampling from a known distribution. The distribution can be Gaussian or a horizon-dependent exponential distribution (i.e., monotonically increasing risk as the horizon increases). This adds risk information to an existing MDP (Bäuerle and Jaśkiewicz. 2024).</w:t>
+      </w:r>
+    </w:p>
+    <w:p>
+      <w:pPr>
+        <w:spacing w:after="200" w:lineRule="auto"/>
+        <w:rPr/>
+      </w:pPr>
+      <w:r>
+        <w:rPr>
+          <w:u w:val="single"/>
+          <w:rtl w:val="0"/>
+        </w:rPr>
+        <w:t xml:space="preserve">Reflection</w:t>
+      </w:r>
+      <w:r>
+        <w:rPr>
+          <w:rtl w:val="0"/>
+        </w:rPr>
+        <w:t xml:space="preserve">:</w:t>
+      </w:r>
+    </w:p>
+    <w:p>
+      <w:pPr>
+        <w:spacing w:after="200" w:lineRule="auto"/>
+        <w:rPr/>
+      </w:pPr>
+      <w:r>
+        <w:rPr>
+          <w:u w:val="single"/>
+          <w:rtl w:val="0"/>
+        </w:rPr>
+        <w:t xml:space="preserve">Replanning</w:t>
+      </w:r>
+      <w:r>
+        <w:rPr>
+          <w:rtl w:val="0"/>
+        </w:rPr>
+        <w:t xml:space="preserve">: </w:t>
+      </w:r>
+    </w:p>
+    <w:p>
+      <w:pPr>
+        <w:spacing w:after="200" w:lineRule="auto"/>
+        <w:rPr/>
+      </w:pPr>
+      <w:r>
+        <w:rPr>
+          <w:b w:val="1"/>
+          <w:bCs w:val="1"/>
+          <w:rtl w:val="0"/>
+        </w:rPr>
+        <w:t xml:space="preserve">(3) Risk-aware optimal policy.</w:t>
+      </w:r>
+      <w:r>
+        <w:rPr>
+          <w:rtl w:val="0"/>
+        </w:rPr>
+        <w:t xml:space="preserve"> We aim to develop an algorithm to determine the optimal policy of the T-MDP for an agent to balance between task completion and task termination over stepwise risk estimates. The sampled risk scores from (2) above are used for initial testing of the algorithm.</w:t>
+      </w:r>
+    </w:p>
+    <w:p>
+      <w:pPr>
+        <w:spacing w:after="200" w:lineRule="auto"/>
+        <w:rPr/>
+      </w:pPr>
+      <w:r>
+        <w:rPr>
+          <w:u w:val="single"/>
+          <w:rtl w:val="0"/>
+        </w:rPr>
+        <w:t xml:space="preserve">Reflection</w:t>
+      </w:r>
+      <w:r>
+        <w:rPr>
+          <w:rtl w:val="0"/>
+        </w:rPr>
+        <w:t xml:space="preserve">:</w:t>
+      </w:r>
+    </w:p>
+    <w:p>
+      <w:pPr>
+        <w:spacing w:after="200" w:lineRule="auto"/>
+        <w:rPr/>
+      </w:pPr>
+      <w:r>
+        <w:rPr>
+          <w:u w:val="single"/>
+          <w:rtl w:val="0"/>
+        </w:rPr>
+        <w:t xml:space="preserve">Replanning</w:t>
+      </w:r>
+      <w:r>
+        <w:rPr>
+          <w:rtl w:val="0"/>
+        </w:rPr>
+        <w:t xml:space="preserve">:</w:t>
+      </w:r>
+    </w:p>
+    <w:p>
+      <w:pPr>
+        <w:spacing w:after="200" w:lineRule="auto"/>
+        <w:rPr>
+          <w:b w:val="1"/>
+          <w:bCs w:val="1"/>
+        </w:rPr>
+      </w:pPr>
+      <w:r>
+        <w:rPr>
+          <w:b w:val="1"/>
+          <w:bCs w:val="1"/>
+          <w:sz w:val="28"/>
+          <w:szCs w:val="28"/>
+          <w:rtl w:val="0"/>
+        </w:rPr>
+        <w:t xml:space="preserve">2. Empirical milestones</w:t>
+      </w:r>
+      <w:r>
+        <w:rPr>
+          <w:rtl w:val="0"/>
+        </w:rPr>
+      </w:r>
+    </w:p>
+    <w:p>
+      <w:pPr>
+        <w:spacing w:after="200" w:lineRule="auto"/>
+        <w:rPr/>
+      </w:pPr>
+      <w:r>
+        <w:rPr>
+          <w:rtl w:val="0"/>
+        </w:rPr>
+        <w:t xml:space="preserve">The empirical milestones concern the implementation of agent environment.</w:t>
+      </w:r>
+    </w:p>
+    <w:p>
+      <w:pPr>
+        <w:spacing w:after="200" w:lineRule="auto"/>
+        <w:rPr/>
+      </w:pPr>
+      <w:r>
+        <w:rPr>
+          <w:b w:val="1"/>
+          <w:bCs w:val="1"/>
+          <w:rtl w:val="0"/>
+        </w:rPr>
+        <w:t xml:space="preserve">(1) Risk judge.</w:t>
+      </w:r>
+      <w:r>
+        <w:rPr>
+          <w:rtl w:val="0"/>
+        </w:rPr>
+        <w:t xml:space="preserve"> </w:t>
+      </w:r>
+      <w:r>
+        <w:rPr>
+          <w:b w:val="1"/>
+          <w:bCs w:val="1"/>
+          <w:rtl w:val="0"/>
+        </w:rPr>
+        <w:t xml:space="preserve"> </w:t>
+      </w:r>
+      <w:r>
+        <w:rPr>
+          <w:rtl w:val="0"/>
+        </w:rPr>
+        <w:t xml:space="preserve">We aim to create a context-based rubric and combine that with an existing domain-dependent scorer in an LLM judge, which together is called a risk judge. The judge evaluates the pending action in the context of the agent trajectory and produces the combined risk score.</w:t>
+      </w:r>
+    </w:p>
+    <w:p>
+      <w:pPr>
+        <w:spacing w:after="200" w:lineRule="auto"/>
+        <w:rPr/>
+      </w:pPr>
+      <w:r>
+        <w:rPr>
+          <w:u w:val="single"/>
+          <w:rtl w:val="0"/>
+        </w:rPr>
+        <w:t xml:space="preserve">Reflection</w:t>
+      </w:r>
+      <w:r>
+        <w:rPr>
+          <w:rtl w:val="0"/>
+        </w:rPr>
+        <w:t xml:space="preserve">:</w:t>
+      </w:r>
+    </w:p>
+    <w:p>
+      <w:pPr>
+        <w:spacing w:after="200" w:lineRule="auto"/>
+        <w:rPr/>
+      </w:pPr>
+      <w:r>
+        <w:rPr>
+          <w:u w:val="single"/>
+          <w:rtl w:val="0"/>
+        </w:rPr>
+        <w:t xml:space="preserve">Replanning</w:t>
+      </w:r>
+      <w:r>
+        <w:rPr>
+          <w:rtl w:val="0"/>
+        </w:rPr>
+        <w:t xml:space="preserve">: </w:t>
+      </w:r>
+    </w:p>
+    <w:p>
+      <w:pPr>
+        <w:spacing w:after="200" w:lineRule="auto"/>
+        <w:rPr/>
+      </w:pPr>
+      <w:r>
+        <w:rPr>
+          <w:b w:val="1"/>
+          <w:bCs w:val="1"/>
+          <w:rtl w:val="0"/>
+        </w:rPr>
+        <w:t xml:space="preserve">(2) Tool-use agent.</w:t>
+      </w:r>
+      <w:r>
+        <w:rPr>
+          <w:rtl w:val="0"/>
+        </w:rPr>
+        <w:t xml:space="preserve"> The agent is a wrapper around an LLM that answers questions through a set of reasoning steps. The domain-dependent scorer is a search tool to ground the relevant information online. The final answer from the agent can be validated through the correct answer in the dataset chosen.</w:t>
+      </w:r>
+    </w:p>
+    <w:p>
+      <w:pPr>
+        <w:spacing w:after="200" w:lineRule="auto"/>
+        <w:rPr/>
+      </w:pPr>
+      <w:r>
+        <w:rPr>
+          <w:u w:val="single"/>
+          <w:rtl w:val="0"/>
+        </w:rPr>
+        <w:t xml:space="preserve">Reflection</w:t>
+      </w:r>
+      <w:r>
+        <w:rPr>
+          <w:rtl w:val="0"/>
+        </w:rPr>
+        <w:t xml:space="preserve">:</w:t>
+      </w:r>
+    </w:p>
+    <w:p>
+      <w:pPr>
+        <w:spacing w:after="200" w:lineRule="auto"/>
+        <w:rPr/>
+      </w:pPr>
+      <w:r>
+        <w:rPr>
+          <w:u w:val="single"/>
+          <w:rtl w:val="0"/>
+        </w:rPr>
+        <w:t xml:space="preserve">Replanning</w:t>
+      </w:r>
+      <w:r>
+        <w:rPr>
+          <w:rtl w:val="0"/>
+        </w:rPr>
+        <w:t xml:space="preserve">: </w:t>
+      </w:r>
+    </w:p>
+    <w:p>
+      <w:pPr>
+        <w:spacing w:after="200" w:lineRule="auto"/>
+        <w:rPr/>
+      </w:pPr>
+      <w:r>
+        <w:rPr>
+          <w:b w:val="1"/>
+          <w:bCs w:val="1"/>
+          <w:rtl w:val="0"/>
+        </w:rPr>
+        <w:t xml:space="preserve">(3) Command-line agent.</w:t>
+      </w:r>
+      <w:r>
+        <w:rPr>
+          <w:rtl w:val="0"/>
+        </w:rPr>
+        <w:t xml:space="preserve"> The agent is a wrapper around an LLM implemented within a sandbox environment to execute cybersecurity-related file operations tasks. The domain-dependent scorer is a rule-based anomaly detector. The final outcome is whether a series of commands pose cybersecurity risk or not, which has ground truth within the dataset. </w:t>
+      </w:r>
+    </w:p>
+    <w:p>
+      <w:pPr>
+        <w:rPr/>
+      </w:pPr>
+      <w:r>
+        <w:rPr>
+          <w:rtl w:val="0"/>
+        </w:rPr>
+        <w:t xml:space="preserve">The essential workflow for the tool-use agent and command-line agent is as follows:</w:t>
+      </w:r>
+    </w:p>
+    <w:p>
+      <w:pPr>
+        <w:spacing w:after="200" w:lineRule="auto"/>
+        <w:rPr/>
+      </w:pPr>
+      <w:r>
+        <w:rPr>
+          <w:rFonts w:ascii="Arial Unicode MS" w:cs="Arial Unicode MS" w:eastAsia="Arial Unicode MS" w:hAnsi="Arial Unicode MS"/>
+          <w:rtl w:val="0"/>
+        </w:rPr>
+        <w:t xml:space="preserve">History parser → Context builder → Risk judge (Rule-based scorer + LLM judge) → Combined risk score → T-MDP policy - create a final verdict based on the score → PROCEED / STOP</w:t>
+      </w:r>
+    </w:p>
+    <w:p>
+      <w:pPr>
+        <w:spacing w:after="200" w:lineRule="auto"/>
+        <w:rPr/>
+      </w:pPr>
+      <w:r>
+        <w:rPr>
+          <w:u w:val="single"/>
+          <w:rtl w:val="0"/>
+        </w:rPr>
+        <w:t xml:space="preserve">Reflection</w:t>
+      </w:r>
+      <w:r>
+        <w:rPr>
+          <w:rtl w:val="0"/>
+        </w:rPr>
+        <w:t xml:space="preserve">:</w:t>
+      </w:r>
+    </w:p>
+    <w:p>
+      <w:pPr>
+        <w:spacing w:after="200" w:lineRule="auto"/>
+        <w:rPr/>
+      </w:pPr>
+      <w:r>
+        <w:rPr>
+          <w:u w:val="single"/>
+          <w:rtl w:val="0"/>
+        </w:rPr>
+        <w:t xml:space="preserve">Replanning</w:t>
+      </w:r>
+      <w:r>
+        <w:rPr>
+          <w:rtl w:val="0"/>
+        </w:rPr>
+        <w:t xml:space="preserve">: </w:t>
+      </w:r>
+    </w:p>
+    <w:p>
+      <w:pPr>
+        <w:spacing w:after="200" w:lineRule="auto"/>
+        <w:rPr>
+          <w:b w:val="1"/>
+          <w:bCs w:val="1"/>
+          <w:sz w:val="28"/>
+          <w:szCs w:val="28"/>
+        </w:rPr>
+      </w:pPr>
+      <w:r>
+        <w:rPr>
+          <w:b w:val="1"/>
+          <w:bCs w:val="1"/>
+          <w:sz w:val="28"/>
+          <w:szCs w:val="28"/>
+          <w:rtl w:val="0"/>
+        </w:rPr>
+        <w:t xml:space="preserve">3. Next steps</w:t>
+      </w:r>
+    </w:p>
+    <w:p>
+      <w:pPr>
+        <w:rPr>
+          <w:b w:val="1"/>
+          <w:bCs w:val="1"/>
+        </w:rPr>
+      </w:pPr>
+      <w:r>
+        <w:rPr>
+          <w:rtl w:val="0"/>
+        </w:rPr>
+        <w:t xml:space="preserve">Given these progresses we have made in the past weeks.</w:t>
+      </w:r>
+      <w:r>
+        <w:br w:type="page"/>
+      </w:r>
+      <w:r>
+        <w:rPr>
+          <w:rtl w:val="0"/>
+        </w:rPr>
+      </w:r>
+    </w:p>
     <w:p>
       <w:pPr>
         <w:jc w:val="center"/>
@@ -135,7 +872,7 @@
                           <pic:cNvPicPr preferRelativeResize="0"/>
                         </pic:nvPicPr>
                         <pic:blipFill>
-                          <a:blip r:embed="rId6">
+                          <a:blip r:embed="rId9">
                             <a:alphaModFix/>
                           </a:blip>
                           <a:stretch>
@@ -229,7 +966,7 @@
                         <pic:cNvPicPr preferRelativeResize="0"/>
                       </pic:nvPicPr>
                       <pic:blipFill>
-                        <a:blip r:embed="rId7"/>
+                        <a:blip r:embed="rId10"/>
                         <a:srcRect/>
                         <a:stretch>
                           <a:fillRect/>
@@ -283,7 +1020,7 @@
         </w:rPr>
         <w:t xml:space="preserve">Ethan Doherty - </w:t>
       </w:r>
-      <w:hyperlink r:id="rId8">
+      <w:hyperlink r:id="rId11">
         <w:r>
           <w:rPr>
             <w:color w:val="1155cc"/>
@@ -320,7 +1057,7 @@
         </w:rPr>
         <w:t xml:space="preserve">Vaibhav Srivastava - </w:t>
       </w:r>
-      <w:hyperlink r:id="rId9">
+      <w:hyperlink r:id="rId12">
         <w:r>
           <w:rPr>
             <w:color w:val="1155cc"/>
@@ -357,7 +1094,7 @@
         </w:rPr>
         <w:t xml:space="preserve">Rui Xian - </w:t>
       </w:r>
-      <w:hyperlink r:id="rId10">
+      <w:hyperlink r:id="rId13">
         <w:r>
           <w:rPr>
             <w:color w:val="1155cc"/>
@@ -727,7 +1464,7 @@
         </w:rPr>
         <w:t xml:space="preserve">We will select examples from realistic reasoning tasks and cybersecurity-related datasets. Candidates for the reasoning tasks are Risky-Bench (Zheng et al., 2026) and SafeToolBench (Xia et al., 2025). Cybersecurity-related tasks are from Security Datasets (</w:t>
       </w:r>
-      <w:hyperlink r:id="rId11">
+      <w:hyperlink r:id="rId14">
         <w:r>
           <w:rPr>
             <w:color w:val="1155cc"/>
@@ -743,7 +1480,7 @@
         </w:rPr>
         <w:t xml:space="preserve">). Examples will be selected from these resources to investigate the termination behavior of the agent in the sandbox environment. For implementing the AI agent framework, we will use the LangChain framework (</w:t>
       </w:r>
-      <w:hyperlink r:id="rId12">
+      <w:hyperlink r:id="rId15">
         <w:r>
           <w:rPr>
             <w:color w:val="1155cc"/>
@@ -1070,7 +1807,7 @@
         </w:rPr>
         <w:t xml:space="preserve">Jingnan Zheng, Yanzhen Luo, Jingjun Xu, Bingnan Liu, Yuxin Chen, Chenhang Cui, Gelei Deng, Chaochao Lu, Xiang Wang, An Zhang, and Tat-Seng Chua. 2026. Risky-Bench: Probing Agentic Safety Risks under Real-World Deployment.</w:t>
       </w:r>
-      <w:hyperlink r:id="rId13">
+      <w:hyperlink r:id="rId16">
         <w:r>
           <w:rPr>
             <w:rtl w:val="0"/>
@@ -1078,7 +1815,7 @@
           <w:t xml:space="preserve"> </w:t>
         </w:r>
       </w:hyperlink>
-      <w:hyperlink r:id="rId14">
+      <w:hyperlink r:id="rId17">
         <w:r>
           <w:rPr>
             <w:color w:val="1155cc"/>
@@ -1377,7 +2114,7 @@
                           <pic:cNvPicPr preferRelativeResize="0"/>
                         </pic:nvPicPr>
                         <pic:blipFill>
-                          <a:blip r:embed="rId6">
+                          <a:blip r:embed="rId9">
                             <a:alphaModFix/>
                           </a:blip>
                           <a:stretch>
@@ -1471,7 +2208,7 @@
                         <pic:cNvPicPr preferRelativeResize="0"/>
                       </pic:nvPicPr>
                       <pic:blipFill>
-                        <a:blip r:embed="rId7"/>
+                        <a:blip r:embed="rId10"/>
                         <a:srcRect/>
                         <a:stretch>
                           <a:fillRect/>
@@ -1525,7 +2262,7 @@
         </w:rPr>
         <w:t xml:space="preserve">Ethan Doherty - </w:t>
       </w:r>
-      <w:hyperlink r:id="rId15">
+      <w:hyperlink r:id="rId18">
         <w:r>
           <w:rPr>
             <w:color w:val="1155cc"/>
@@ -1562,7 +2299,7 @@
         </w:rPr>
         <w:t xml:space="preserve">Vaibhav Srivastava - </w:t>
       </w:r>
-      <w:hyperlink r:id="rId16">
+      <w:hyperlink r:id="rId19">
         <w:r>
           <w:rPr>
             <w:color w:val="1155cc"/>
@@ -1599,7 +2336,7 @@
         </w:rPr>
         <w:t xml:space="preserve">Rui Xian - </w:t>
       </w:r>
-      <w:hyperlink r:id="rId17">
+      <w:hyperlink r:id="rId20">
         <w:r>
           <w:rPr>
             <w:color w:val="1155cc"/>
@@ -1849,7 +2586,7 @@
         </w:rPr>
         <w:t xml:space="preserve">We will select examples from realistic tasks and cybersecurity-related datasets. Candidates for the realistic tasks are Risky-Bench (Zheng et al., 2026) and SafeToolBench (Xia et al., 2025). Cybersecurity-related tasks are from Security Datasets (</w:t>
       </w:r>
-      <w:hyperlink r:id="rId18">
+      <w:hyperlink r:id="rId21">
         <w:r>
           <w:rPr>
             <w:color w:val="1155cc"/>
@@ -1865,7 +2602,7 @@
         </w:rPr>
         <w:t xml:space="preserve">). Examples will be selected from these resources to investigate the termination behavior of the agent in the sandbox environment. For implementing the AI agent framework, we will use the LangChain framework (</w:t>
       </w:r>
-      <w:hyperlink r:id="rId19">
+      <w:hyperlink r:id="rId22">
         <w:r>
           <w:rPr>
             <w:color w:val="1155cc"/>
@@ -2106,7 +2843,7 @@
         </w:rPr>
         <w:t xml:space="preserve">Jingnan Zheng, Yanzhen Luo, Jingjun Xu, Bingnan Liu, Yuxin Chen, Chenhang Cui, Gelei Deng, Chaochao Lu, Xiang Wang, An Zhang, and Tat-Seng Chua. 2026. Risky-Bench: Probing Agentic Safety Risks under Real-World Deployment.</w:t>
       </w:r>
-      <w:hyperlink r:id="rId20">
+      <w:hyperlink r:id="rId23">
         <w:r>
           <w:rPr>
             <w:rtl w:val="0"/>
@@ -2114,7 +2851,7 @@
           <w:t xml:space="preserve"> </w:t>
         </w:r>
       </w:hyperlink>
-      <w:hyperlink r:id="rId21">
+      <w:hyperlink r:id="rId24">
         <w:r>
           <w:rPr>
             <w:color w:val="1155cc"/>
@@ -2256,7 +2993,7 @@
       <w:pPr>
         <w:rPr/>
       </w:pPr>
-      <w:hyperlink r:id="rId22">
+      <w:hyperlink r:id="rId25">
         <w:r>
           <w:rPr>
             <w:color w:val="1155cc"/>
@@ -2287,7 +3024,7 @@
       <w:pPr>
         <w:rPr/>
       </w:pPr>
-      <w:hyperlink r:id="rId23">
+      <w:hyperlink r:id="rId26">
         <w:r>
           <w:rPr>
             <w:color w:val="1155cc"/>
@@ -2318,7 +3055,7 @@
       <w:pPr>
         <w:rPr/>
       </w:pPr>
-      <w:hyperlink r:id="rId24">
+      <w:hyperlink r:id="rId27">
         <w:r>
           <w:rPr>
             <w:color w:val="1155cc"/>
@@ -2338,7 +3075,7 @@
       <w:pPr>
         <w:rPr/>
       </w:pPr>
-      <w:hyperlink r:id="rId25">
+      <w:hyperlink r:id="rId28">
         <w:r>
           <w:rPr>
             <w:color w:val="1155cc"/>
@@ -2390,7 +3127,7 @@
       <w:pPr>
         <w:rPr/>
       </w:pPr>
-      <w:hyperlink r:id="rId26">
+      <w:hyperlink r:id="rId29">
         <w:r>
           <w:rPr>
             <w:color w:val="1155cc"/>
@@ -2431,7 +3168,7 @@
       <w:pPr>
         <w:rPr/>
       </w:pPr>
-      <w:hyperlink r:id="rId27">
+      <w:hyperlink r:id="rId30">
         <w:r>
           <w:rPr>
             <w:color w:val="1155cc"/>
@@ -2493,7 +3230,7 @@
       <w:pPr>
         <w:rPr/>
       </w:pPr>
-      <w:hyperlink r:id="rId28">
+      <w:hyperlink r:id="rId31">
         <w:r>
           <w:rPr>
             <w:color w:val="1155cc"/>
@@ -2513,7 +3250,7 @@
       <w:pPr>
         <w:rPr/>
       </w:pPr>
-      <w:hyperlink r:id="rId29">
+      <w:hyperlink r:id="rId32">
         <w:r>
           <w:rPr>
             <w:color w:val="1155cc"/>

</xml_diff>